<commit_message>
Frame thesis as in-depth study of selected port technology aspects; note cross-aspect links as future work
Co-Authored-By: Claude Opus 5.5 <noreply@anthropic.com>
Claude-Session: https://claude.ai/code/session_01EARyaH78jfr9YdoQ2kyo5P
</commit_message>
<xml_diff>
--- a/examiner4/01_Ch1_and_Ch7-2_revision_draft.docx
+++ b/examiner4/01_Ch1_and_Ch7-2_revision_draft.docx
@@ -256,7 +256,7 @@
         <w:rPr>
           <w:color w:val="7030A0"/>
         </w:rPr>
-        <w:t xml:space="preserve">The overall objective of this thesis is to investigate how technological development in transport infrastructure, with a focus on ports, relates to innovation capability, operational productivity and sustainability at the national, organisational and operational levels. Because the factors that explain technology advancement differ from one level of analysis to another, each empirical study is conducted in the setting where the relevant variation can be observed and comparable data are available. The national-level study draws on European countries (Chapter 4), the organisational-level study on Chinese container terminal operators (Chapter 5), and the operational-level study on harbour craft in the Port of Singapore (Chapter 6). The thesis therefore adopts a multi-level, multi-context design. Rather than estimating a single pooled model across the three settings, it connects the studies through the theoretical mechanisms they share and through an explicit assessment of how country-specific factors condition the findings (Section 7.2). The rationale for the choice of each setting is set out in Section 1.4. To achieve this aim, the research is structured around the following specific objectives:</w:t>
+        <w:t xml:space="preserve">The overall objective of this thesis is to investigate how technological development in transport infrastructure, with a focus on ports, relates to innovation capability, operational productivity and sustainability at the national, organisational and operational levels. Because the factors that explain technology advancement differ from one level of analysis to another, each empirical study is conducted in the setting where the relevant variation can be observed and comparable data are available. The national-level study draws on European countries (Chapter 4), the organisational-level study on Chinese container terminal operators (Chapter 5), and the operational-level study on harbour craft in the Port of Singapore (Chapter 6). The thesis therefore adopts a multi-level, multi-context design. Within the broad field of port technology advancement, the thesis examines each of these aspects in depth rather than testing the interconnections between them, which are left for future research (Section 7.4). Rather than estimating a single pooled model across the three settings, it connects the studies through the theoretical mechanisms they share and through an explicit assessment of how country-specific factors condition the findings (Section 7.2). The rationale for the choice of each setting is set out in Section 1.4. To achieve this aim, the research is structured around the following specific objectives:</w:t>
       </w:r>
     </w:p>
     <w:bookmarkEnd w:id="20"/>
@@ -737,7 +737,63 @@
         <w:rPr>
           <w:color w:val="7030A0"/>
         </w:rPr>
-        <w:t xml:space="preserve">Chapters 4, 5 and 6 examine technology advancement at different levels of analysis and in different national settings. Their results cannot be combined in a single estimated model, and the coefficients reported in each chapter apply only to the setting in which they were estimated. The findings can nevertheless be integrated at the stage of interpretation, by examining how they relate to one another and what they jointly imply (Fetters et al., 2013). This section first sets out how the studies are linked and the mechanisms they share (Section 7.2.1). It then examines the country-specific factors that underlie the findings (Section 7.2.2), and finally discusses the extent to which the findings can be transferred to other contexts (Section 7.2.3).</w:t>
+        <w:t xml:space="preserve">Technology advancement in ports is a broad field that comprises many specific aspects, such as innovation and investment, automation and cargo-handling equipment, digitalisation, productivity and environmental sustainability. Port development frameworks such as the sixth-generation port concept treat these as related dimensions of a single process of port transformation (Lee et al., 2025), yet, as the review in Chapter 3 showed, they have largely been studied separately, and a systematic framework for understanding port technology development is still lacking. This thesis brings several of these aspects together within one research design, but it examines each in depth within its own study: innovation capability at the national level (Chapter 4), equipment deployment and technological progress at the organisational level (Chapter 5), and sustainable operations at the operational level (Chapter 6). The interconnections between these aspects were not tested empirically, as this would require data that link national innovation conditions, terminal equipment and vessel operations for the same port system, which were not available for this research. The in-depth study of each aspect is nonetheless a necessary step. Each aspect has its own unit of analysis, data requirements and appropriate methods, and a reliable integrated model can be built only once the constructs, measures and relationships within each aspect have been established. The frameworks and findings of the three studies therefore provide building blocks for a future empirical synthesis (Section 7.4).</w:t>
+      </w:r>
+    </w:p>
+    <w:p>
+      <w:pPr>
+        <w:pStyle w:val="BodyText"/>
+      </w:pPr>
+      <w:r>
+        <w:rPr>
+          <w:color w:val="7030A0"/>
+        </w:rPr>
+        <w:t xml:space="preserve">For the same reason, the results of the three studies cannot be combined in a single estimated model, and the coefficients reported in each chapter apply only to the setting in which they were estimated. The findings can nevertheless be integrated at the stage of interpretation, by examining how they relate to one another and what they jointly imply (Fetters et al., 2013). This section first sets out how the studies are linked and the mechanisms they share (Section 7.2.1). It then examines the country-specific factors that underlie the findings (Section 7.2.2), and finally discusses the extent to which the findings can be transferred to other contexts (Section 7.2.3).</w:t>
+      </w:r>
+    </w:p>
+    <w:p>
+      <w:pPr>
+        <w:pStyle w:val="BlockText"/>
+      </w:pPr>
+      <w:r>
+        <w:rPr>
+          <w:iCs/>
+          <w:i/>
+          <w:color w:val="606060"/>
+        </w:rPr>
+        <w:t xml:space="preserve">Section 7.4 (future research) should include a matching sentence when we revise it, for example:</w:t>
+      </w:r>
+      <w:r>
+        <w:rPr>
+          <w:iCs/>
+          <w:i/>
+          <w:color w:val="606060"/>
+        </w:rPr>
+        <w:t xml:space="preserve"> </w:t>
+      </w:r>
+      <w:r>
+        <w:rPr>
+          <w:iCs/>
+          <w:i/>
+          <w:color w:val="606060"/>
+        </w:rPr>
+        <w:t xml:space="preserve">“</w:t>
+      </w:r>
+      <w:r>
+        <w:rPr>
+          <w:iCs/>
+          <w:i/>
+          <w:color w:val="606060"/>
+        </w:rPr>
+        <w:t xml:space="preserve">Future research could examine the interconnections between the aspects studied in this thesis directly, by assembling linked data for a single port system that combine national or regional innovation conditions, terminal equipment and productivity, and vessel-level energy and emissions, and by estimating multi-level models that test the cross-level implications proposed in Section 7.2.1.</w:t>
+      </w:r>
+      <w:r>
+        <w:rPr>
+          <w:iCs/>
+          <w:i/>
+          <w:color w:val="606060"/>
+        </w:rPr>
+        <w:t xml:space="preserve">”</w:t>
       </w:r>
     </w:p>
     <w:bookmarkStart w:id="28" w:name="X8fdd657a093ecc3c9f3d472089b2c90d39d3690"/>
@@ -3278,6 +3334,37 @@
           <w:color w:val="7030A0"/>
         </w:rPr>
         <w:t xml:space="preserve">(6), 791–806. https://doi.org/10.1080/01441647.2011.597005 †</w:t>
+      </w:r>
+    </w:p>
+    <w:p>
+      <w:pPr>
+        <w:pStyle w:val="BodyText"/>
+      </w:pPr>
+      <w:r>
+        <w:rPr>
+          <w:color w:val="7030A0"/>
+        </w:rPr>
+        <w:t xml:space="preserve">Lee, P. T.-W., Song, Z.-Y., Lin, C.-W., Lam, J. S. L., &amp; Chen, J. (2025). New framework of port logistics in the post-COVID-19 period with 6th-generation ports (6GP) model.</w:t>
+      </w:r>
+      <w:r>
+        <w:rPr>
+          <w:color w:val="7030A0"/>
+        </w:rPr>
+        <w:t xml:space="preserve"> </w:t>
+      </w:r>
+      <w:r>
+        <w:rPr>
+          <w:iCs/>
+          <w:i/>
+          <w:color w:val="7030A0"/>
+        </w:rPr>
+        <w:t xml:space="preserve">Transport Reviews, 45</w:t>
+      </w:r>
+      <w:r>
+        <w:rPr>
+          <w:color w:val="7030A0"/>
+        </w:rPr>
+        <w:t xml:space="preserve">(1), 77–93. https://doi.org/10.1080/01441647.2024.2405205 †</w:t>
       </w:r>
     </w:p>
     <w:p>

</xml_diff>

<commit_message>
Add human capital as a third shared mechanism in Section 7.2.1
Co-Authored-By: Claude Opus 5.5 <noreply@anthropic.com>
Claude-Session: https://claude.ai/code/session_01EARyaH78jfr9YdoQ2kyo5P
</commit_message>
<xml_diff>
--- a/examiner4/01_Ch1_and_Ch7-2_revision_draft.docx
+++ b/examiner4/01_Ch1_and_Ch7-2_revision_draft.docx
@@ -669,7 +669,7 @@
         <w:rPr>
           <w:color w:val="7030A0"/>
         </w:rPr>
-        <w:t xml:space="preserve">Overall, the significance of this research lies in its multi-level analytical perspective. Rather than examining technology advancement from a single angle, the thesis combines a theoretical review of port technology development (Chapter 3) with three empirical studies: a national-level analysis of factors associated with participation in technology projects in European countries (Chapter 4), an organisational-level evaluation of equipment deployment and technological progress in Chinese container terminals (Chapter 5), and an operational-level assessment of biofuel adoption in Singapore’s harbour craft using machine learning (Chapter 6). Since the empirical studies are set in different contexts, they are not combined into a single estimated model. Instead, they are integrated through the implications that each level carries for the others, through two mechanisms that recur across them, namely capability and institutional and policy conditions, and through an explicit discussion of how country-specific factors shape the transferability of the findings (Section 7.2). This approach advances academic understanding while offering stakeholders practical, context-sensitive guidance on port technology development in an era of global trade and decarbonisation.</w:t>
+        <w:t xml:space="preserve">Overall, the significance of this research lies in its multi-level analytical perspective. Rather than examining technology advancement from a single angle, the thesis combines a theoretical review of port technology development (Chapter 3) with three empirical studies: a national-level analysis of factors associated with participation in technology projects in European countries (Chapter 4), an organisational-level evaluation of equipment deployment and technological progress in Chinese container terminals (Chapter 5), and an operational-level assessment of biofuel adoption in Singapore’s harbour craft using machine learning (Chapter 6). Since the empirical studies are set in different contexts, they are not combined into a single estimated model. Instead, they are integrated through the implications that each level carries for the others, through three mechanisms that recur across them, namely technological capability, human capital, and institutional and policy conditions, and through an explicit discussion of how country-specific factors shape the transferability of the findings (Section 7.2). This approach advances academic understanding while offering stakeholders practical, context-sensitive guidance on port technology development in an era of global trade and decarbonisation.</w:t>
       </w:r>
     </w:p>
     <w:bookmarkEnd w:id="22"/>
@@ -937,18 +937,29 @@
         <w:rPr>
           <w:color w:val="7030A0"/>
         </w:rPr>
-        <w:t xml:space="preserve">Beyond this sequence, two mechanisms recur across the three studies and help to explain why the findings take the form they do. The first is capability. Absorptive capacity theory holds that the benefit an organisation or a country obtains from external technology depends on its prior knowledge and its ability to recognise, assimilate and apply new knowledge (Cohen &amp; Levinthal, 1990). The findings are consistent with this view at each level. In Chapter 4, technology capability mediates the effects of government incentives and innovation input on participation, so that public support is associated with participation mainly through the capability it builds. In Chapter 5, terminals with a higher share of employees holding a bachelor’s degree or above show higher technological progress. In Chapter 6, the models show that onboard data can be used to predict fuel consumption and emissions and to identify blending ratios accurately. This is the analytical capability that operators and regulators need in order to adopt biofuel on the basis of evidence. Across the three levels, technology advancement therefore depends not only on access to technology but also on the capability to make use of it.</w:t>
-      </w:r>
-    </w:p>
-    <w:p>
-      <w:pPr>
-        <w:pStyle w:val="BodyText"/>
-      </w:pPr>
-      <w:r>
-        <w:rPr>
-          <w:color w:val="7030A0"/>
-        </w:rPr>
-        <w:t xml:space="preserve">The second mechanism is the influence of institutional and policy conditions. National innovation system theory holds that technological change is shaped by the institutions and policies within which organisations operate (OECD, 2002). In Chapter 4, government R&amp;D incentives and a favourable R&amp;D environment, reflected in legal structure, property rights and academic freedom, are associated with stronger technological capacity. In Chapter 5, ownership structure, itself a product of port governance reform (Notteboom &amp; Yang, 2017), is associated with the rate of technological progress. Chapter 6 does not model policy directly, but the technology it examines is adopted largely in response to regulation, in particular Singapore’s requirements for new harbour craft from 2030 (MPA Singapore, 2024b), and its results bear directly on regulatory design. Because institutional and policy conditions differ markedly between countries, this mechanism is also the main reason why the findings are context-specific, as discussed in the next section.</w:t>
+        <w:t xml:space="preserve">Beyond this sequence, three mechanisms recur across the studies and help to explain why the findings take the form they do. The first is technological capability. Absorptive capacity theory holds that the benefit an organisation or a country obtains from external technology depends on its prior knowledge and its ability to recognise, assimilate and apply new knowledge (Cohen &amp; Levinthal, 1990). In Chapter 4, technology capability mediates the effects of government incentives and innovation input on participation, so that public support is associated with participation mainly through the capability it builds. In Chapter 5, allowing terminal-specific intercepts and slopes improves the fit of the growth models, which shows that terminals operating under the same national regime differ in their technology levels and rates of technological progress, consistent with differences in organisational capability. In Chapter 6, the models show that onboard data can be used to predict fuel consumption and emissions and to identify blending ratios accurately, which is the analytical capability that operators and regulators need in order to adopt biofuel on the basis of evidence. Technology advancement therefore depends not only on access to technology but also on the capability to make use of it.</w:t>
+      </w:r>
+    </w:p>
+    <w:p>
+      <w:pPr>
+        <w:pStyle w:val="BodyText"/>
+      </w:pPr>
+      <w:r>
+        <w:rPr>
+          <w:color w:val="7030A0"/>
+        </w:rPr>
+        <w:t xml:space="preserve">The second mechanism is human capital. Human capital theory holds that education and skills raise the capacity to adopt and implement new technologies, so that the pace of technology diffusion depends on the educational level of the workforce (Benhabib &amp; Spiegel, 1994; Nelson &amp; Phelps, 1966). From the resource-based perspective reviewed in Chapter 3, skilled people are also an organisational resource that complements physical equipment (Section 3.4.2). This mechanism appears at each level, although it is measured differently. In Chapter 4, researchers in the civil and transport sectors are part of national innovation input, and higher-education researchers are part of technological innovation capacity in the port case, so the human resources devoted to research are embedded in the capability associated with participation. In Chapter 5, terminals with a higher share of employees holding a bachelor’s degree or above show higher technological progress, which is the most direct evidence of this mechanism in the thesis. Chapter 6 does not measure human capital, but its implications depend on it. The machine-learning models are decision-support tools whose value relies on staff able to collect, interpret and act on operational data, and Singapore’s transition to new marine fuels involves crew training alongside infrastructure, regulations and safety standards (MPA Singapore, 2024b). Technology advancement in ports therefore requires investment in people as well as in equipment and systems.</w:t>
+      </w:r>
+    </w:p>
+    <w:p>
+      <w:pPr>
+        <w:pStyle w:val="BodyText"/>
+      </w:pPr>
+      <w:r>
+        <w:rPr>
+          <w:color w:val="7030A0"/>
+        </w:rPr>
+        <w:t xml:space="preserve">The third mechanism is the influence of institutional and policy conditions. National innovation system theory holds that technological change is shaped by the institutions and policies within which organisations operate (OECD, 2002). In Chapter 4, government R&amp;D incentives and a favourable R&amp;D environment, reflected in legal structure, property rights and academic freedom, are associated with stronger technological capacity. In Chapter 5, ownership structure, itself a product of port governance reform (Notteboom &amp; Yang, 2017), is associated with the rate of technological progress. Chapter 6 does not model policy directly, but the technology it examines is adopted largely in response to regulation, in particular Singapore’s requirements for new harbour craft from 2030 (MPA Singapore, 2024b), and its results bear directly on regulatory design. Because institutional and policy conditions differ markedly between countries, this mechanism is also the main reason why the findings are context-specific, as discussed in the next section.</w:t>
       </w:r>
     </w:p>
     <w:bookmarkEnd w:id="28"/>
@@ -2721,7 +2732,7 @@
         <w:rPr>
           <w:color w:val="7030A0"/>
         </w:rPr>
-        <w:t xml:space="preserve">Some lessons are nonetheless common to all three studies and are therefore the most widely transferable. Technology advancement depends on capability as well as on investment. It is shaped by the institutional and policy conditions under which it takes place. And sustainable technologies involve trade-offs that should be measured with operational data before they are adopted at scale.</w:t>
+        <w:t xml:space="preserve">Some lessons are nonetheless common to all three studies and are therefore the most widely transferable. Technology advancement depends on capability and skilled people as well as on investment. It is shaped by the institutional and policy conditions under which it takes place. And sustainable technologies involve trade-offs that should be measured with operational data before they are adopted at scale.</w:t>
       </w:r>
     </w:p>
     <w:bookmarkEnd w:id="30"/>
@@ -2935,6 +2946,37 @@
         <w:rPr>
           <w:color w:val="7030A0"/>
         </w:rPr>
+        <w:t xml:space="preserve">Benhabib, J., &amp; Spiegel, M. M. (1994). The role of human capital in economic development: Evidence from aggregate cross-country data.</w:t>
+      </w:r>
+      <w:r>
+        <w:rPr>
+          <w:color w:val="7030A0"/>
+        </w:rPr>
+        <w:t xml:space="preserve"> </w:t>
+      </w:r>
+      <w:r>
+        <w:rPr>
+          <w:iCs/>
+          <w:i/>
+          <w:color w:val="7030A0"/>
+        </w:rPr>
+        <w:t xml:space="preserve">Journal of Monetary Economics, 34</w:t>
+      </w:r>
+      <w:r>
+        <w:rPr>
+          <w:color w:val="7030A0"/>
+        </w:rPr>
+        <w:t xml:space="preserve">(2), 143–173. https://doi.org/10.1016/0304-3932(94)90047-7</w:t>
+      </w:r>
+    </w:p>
+    <w:p>
+      <w:pPr>
+        <w:pStyle w:val="BodyText"/>
+      </w:pPr>
+      <w:r>
+        <w:rPr>
+          <w:color w:val="7030A0"/>
+        </w:rPr>
         <w:t xml:space="preserve">Cohen, W. M., &amp; Levinthal, D. A. (1990). Absorptive capacity: A new perspective on learning and innovation.</w:t>
       </w:r>
       <w:r>
@@ -3575,6 +3617,37 @@
           <w:color w:val="7030A0"/>
         </w:rPr>
         <w:t xml:space="preserve">. Singapore Infopedia. https://eresources.nlb.gov.sg/infopedia/articles/SIP_577_2005-01-27.html</w:t>
+      </w:r>
+    </w:p>
+    <w:p>
+      <w:pPr>
+        <w:pStyle w:val="BodyText"/>
+      </w:pPr>
+      <w:r>
+        <w:rPr>
+          <w:color w:val="7030A0"/>
+        </w:rPr>
+        <w:t xml:space="preserve">Nelson, R. R., &amp; Phelps, E. S. (1966). Investment in humans, technological diffusion, and economic growth.</w:t>
+      </w:r>
+      <w:r>
+        <w:rPr>
+          <w:color w:val="7030A0"/>
+        </w:rPr>
+        <w:t xml:space="preserve"> </w:t>
+      </w:r>
+      <w:r>
+        <w:rPr>
+          <w:iCs/>
+          <w:i/>
+          <w:color w:val="7030A0"/>
+        </w:rPr>
+        <w:t xml:space="preserve">American Economic Review, 56</w:t>
+      </w:r>
+      <w:r>
+        <w:rPr>
+          <w:color w:val="7030A0"/>
+        </w:rPr>
+        <w:t xml:space="preserve">(1/2), 69–75.</w:t>
       </w:r>
     </w:p>
     <w:p>

</xml_diff>

<commit_message>
Revise Section 2.4 gaps on heterogeneity and embodiment of technology; propagate to Chapters 1, 4-7
Rewrite Section 2.4 with six gaps (heterogeneity, embodiment, theory, and three
empirical gaps), add supporting paragraphs to 2.1.2 and 2.3, and add related
text to 4.3.1/4.6, 5.3.2/5.6, 6.3/6.5 and 7.2.3/7.3/7.4. Add the 7.2.3
paragraph and the Chountalas et al. (2023) reference to the Chapter 7 draft and
fix the reference order there.

Co-Authored-By: Claude Opus 5.5 <noreply@anthropic.com>
Claude-Session: https://claude.ai/code/session_01EARyaH78jfr9YdoQ2kyo5P
</commit_message>
<xml_diff>
--- a/examiner4/01_Ch1_and_Ch7-2_revision_draft.docx
+++ b/examiner4/01_Ch1_and_Ch7-2_revision_draft.docx
@@ -2109,6 +2109,17 @@
         <w:rPr>
           <w:color w:val="7030A0"/>
         </w:rPr>
+        <w:t xml:space="preserve">Transferability is limited not only by context but also by the nature of technology itself. As discussed in Sections 2.1.2 and 2.4, technology is heterogeneous and is usually embodied in machines and equipment. Each study therefore measures technology in a form suited to its level: national capability indicators in Chapter 4, the number and capacity of cranes together with the Malmquist frontier shift in Chapter 5, and the performance of fuel blends in a given engine in Chapter 6. The findings refer to these specific forms of technology and should not be generalised to technology as a whole. The Chapter 5 results concern cargo-handling cranes in container terminals and may not hold for digital systems, and the Chapter 6 results concern biodiesel blends in high-speed diesel engines and may differ for other engine types (Chountalas et al., 2023).</w:t>
+      </w:r>
+    </w:p>
+    <w:p>
+      <w:pPr>
+        <w:pStyle w:val="BodyText"/>
+      </w:pPr>
+      <w:r>
+        <w:rPr>
+          <w:color w:val="7030A0"/>
+        </w:rPr>
         <w:t xml:space="preserve">The European finding that incentives work largely by strengthening capability is most likely to be repeated in economies with strong innovation systems and voluntary, project-based participation in technology development, such as advanced Asian economies. Where governments plan and finance port technology directly, as is common under the Asian port doctrine (Lee &amp; Flynn, 2011), participation may be driven by state programmes rather than by capability built through incentives. The mediating role of capability may then be weaker. In such settings, the European result should inform the design of policy rather than be copied directly (Dolowitz &amp; Marsh, 2000).</w:t>
       </w:r>
     </w:p>
@@ -2915,6 +2926,37 @@
         <w:rPr>
           <w:color w:val="7030A0"/>
         </w:rPr>
+        <w:t xml:space="preserve">Benhabib, J., &amp; Spiegel, M. M. (1994). The role of human capital in economic development: Evidence from aggregate cross-country data.</w:t>
+      </w:r>
+      <w:r>
+        <w:rPr>
+          <w:color w:val="7030A0"/>
+        </w:rPr>
+        <w:t xml:space="preserve"> </w:t>
+      </w:r>
+      <w:r>
+        <w:rPr>
+          <w:iCs/>
+          <w:i/>
+          <w:color w:val="7030A0"/>
+        </w:rPr>
+        <w:t xml:space="preserve">Journal of Monetary Economics, 34</w:t>
+      </w:r>
+      <w:r>
+        <w:rPr>
+          <w:color w:val="7030A0"/>
+        </w:rPr>
+        <w:t xml:space="preserve">(2), 143–173. https://doi.org/10.1016/0304-3932(94)90047-7</w:t>
+      </w:r>
+    </w:p>
+    <w:p>
+      <w:pPr>
+        <w:pStyle w:val="BodyText"/>
+      </w:pPr>
+      <w:r>
+        <w:rPr>
+          <w:color w:val="7030A0"/>
+        </w:rPr>
         <w:t xml:space="preserve">Cartwright, N., &amp; Hardie, J. (2012).</w:t>
       </w:r>
       <w:r>
@@ -2946,27 +2988,27 @@
         <w:rPr>
           <w:color w:val="7030A0"/>
         </w:rPr>
-        <w:t xml:space="preserve">Benhabib, J., &amp; Spiegel, M. M. (1994). The role of human capital in economic development: Evidence from aggregate cross-country data.</w:t>
-      </w:r>
-      <w:r>
-        <w:rPr>
-          <w:color w:val="7030A0"/>
-        </w:rPr>
-        <w:t xml:space="preserve"> </w:t>
-      </w:r>
-      <w:r>
-        <w:rPr>
-          <w:iCs/>
-          <w:i/>
-          <w:color w:val="7030A0"/>
-        </w:rPr>
-        <w:t xml:space="preserve">Journal of Monetary Economics, 34</w:t>
-      </w:r>
-      <w:r>
-        <w:rPr>
-          <w:color w:val="7030A0"/>
-        </w:rPr>
-        <w:t xml:space="preserve">(2), 143–173. https://doi.org/10.1016/0304-3932(94)90047-7</w:t>
+        <w:t xml:space="preserve">Chountalas, T. D., Founti, M., &amp; Hountalas, D. T. (2023). Review of biofuel effect on emissions of various types of marine propulsion and auxiliary engines.</w:t>
+      </w:r>
+      <w:r>
+        <w:rPr>
+          <w:color w:val="7030A0"/>
+        </w:rPr>
+        <w:t xml:space="preserve"> </w:t>
+      </w:r>
+      <w:r>
+        <w:rPr>
+          <w:iCs/>
+          <w:i/>
+          <w:color w:val="7030A0"/>
+        </w:rPr>
+        <w:t xml:space="preserve">Energies, 16</w:t>
+      </w:r>
+      <w:r>
+        <w:rPr>
+          <w:color w:val="7030A0"/>
+        </w:rPr>
+        <w:t xml:space="preserve">(12), 4647. https://doi.org/10.3390/en16124647</w:t>
       </w:r>
     </w:p>
     <w:p>

</xml_diff>

<commit_message>
Rename Chapter 4 construct TC to technology development level (TDL) with revised definition and references
Add file 06 with the new definition, rewritten hypotheses H1-H3, sentence-level
changes for Chapters 1, 4 and 7, port-model abbreviation TIC, reference review
(replacing Moro 2012 and Gupta et al. 2020 where they did not support the claims)
and a draft response. Update files 01, 02, 03 and 05 to the new name.

Co-Authored-By: Claude Opus 5.5 <noreply@anthropic.com>
Claude-Session: https://claude.ai/code/session_01EARyaH78jfr9YdoQ2kyo5P
</commit_message>
<xml_diff>
--- a/examiner4/01_Ch1_and_Ch7-2_revision_draft.docx
+++ b/examiner4/01_Ch1_and_Ch7-2_revision_draft.docx
@@ -314,7 +314,7 @@
         <w:rPr>
           <w:color w:val="7030A0"/>
         </w:rPr>
-        <w:t xml:space="preserve">At the national level, Chapter 4 requires cross-national variation in government incentives, innovation input and technology capability, measured on a comparable basis. European countries meet this requirement for three reasons. First, the data are harmonised. Project-level information is drawn from the European Commission’s Transport Research and Innovation Monitoring and Information System (TRIMIS), which records transport research and innovation projects under common reporting conventions (European Commission, 2023b), while national R&amp;D indicators follow the definitions of the Frascati Manual (OECD, 2015). Second, the countries share a broadly common policy framework: most projects in the sample are funded by the European Commission or by European national governments under common programme rules, and most of the countries belong to the Continental European port doctrine, in which ports are regarded as part of wider public infrastructure (Lee &amp; Flynn, 2011). Third, considerable variation exists within this common framework. National innovation systems in Europe remain diverse (Kaiser &amp; Prange, 2004), and the European Innovation Scoreboard distinguishes innovation leaders, concentrated in Northern and Western Europe, from moderate and emerging innovators, many of which are in Southern and Eastern Europe (European Commission, 2024). The combination of comparable measurement and substantial differences in innovation capability and public support makes European countries an appropriate setting for testing the hypothesised national-level relationships, which a single-country design, with national policy held essentially constant, could not identify.</w:t>
+        <w:t xml:space="preserve">At the national level, Chapter 4 requires cross-national variation in government incentives, innovation input and the technology development level, measured on a comparable basis. European countries meet this requirement for three reasons. First, the data are harmonised. Project-level information is drawn from the European Commission’s Transport Research and Innovation Monitoring and Information System (TRIMIS), which records transport research and innovation projects under common reporting conventions (European Commission, 2023b), while national R&amp;D indicators follow the definitions of the Frascati Manual (OECD, 2015). Second, the countries share a broadly common policy framework: most projects in the sample are funded by the European Commission or by European national governments under common programme rules, and most of the countries belong to the Continental European port doctrine, in which ports are regarded as part of wider public infrastructure (Lee &amp; Flynn, 2011). Third, considerable variation exists within this common framework. National innovation systems in Europe remain diverse (Kaiser &amp; Prange, 2004), and the European Innovation Scoreboard distinguishes innovation leaders, concentrated in Northern and Western Europe, from moderate and emerging innovators, many of which are in Southern and Eastern Europe (European Commission, 2024). The combination of comparable measurement and substantial differences in innovation capability and public support makes European countries an appropriate setting for testing the hypothesised national-level relationships, which a single-country design, with national policy held essentially constant, could not identify.</w:t>
       </w:r>
     </w:p>
     <w:p>
@@ -926,18 +926,18 @@
         <w:rPr>
           <w:color w:val="7030A0"/>
         </w:rPr>
-        <w:t xml:space="preserve">The three studies follow technology advancement from its development to its deployment and its sustainable use. At the national level, Chapter 4 shows that government incentives and innovation input are associated with stronger national technology capability, which is in turn associated with greater participation in transport and port technology projects. These results describe the enabling conditions, namely public funding, knowledge resources and a supportive R&amp;D environment, under which port organisations decide whether to invest in new technologies. At the organisational level, Chapter 5 examines how technology is embodied in landside cargo-handling equipment and translated into productivity: crane number and capacity follow throughput growth, and technological progress is associated with workforce education and with greater private participation in ownership. At the operational level, Chapter 6 turns to the waterside, where the question is no longer how much technology is deployed but whether its use is sustainable: biofuel blends reduce CO₂ and CO emissions but increase NOₓ emissions and fuel consumption, and machine-learning models make these effects measurable. Each level therefore carries implications for the next. National capability and incentives shape the knowledge and resources available to terminal operators; operators’ investment and workforce decisions determine their readiness to adopt new technologies, including cleaner energy; and operational evidence on sustainability trade-offs indicates where national policy and port regulation may need to intervene, for example through complementary NOₓ control. Although the levels run from macro to micro, they are not nested within one another, because each is examined in a different setting: the Chinese terminals are not part of the European sample, and the Singapore harbour craft are not part of the Chinese terminal system. The levels are therefore analytical rather than hierarchical, and the links between them are conceptual implications rather than estimated cross-level effects. The level distinction is complemented by a functional one. Chapter 5 addresses landside cargo handling, where productivity is the main objective, and Chapter 6 addresses waterside port services, where emissions are the main concern. Together they cover the two main operating domains of a port.</w:t>
-      </w:r>
-    </w:p>
-    <w:p>
-      <w:pPr>
-        <w:pStyle w:val="BodyText"/>
-      </w:pPr>
-      <w:r>
-        <w:rPr>
-          <w:color w:val="7030A0"/>
-        </w:rPr>
-        <w:t xml:space="preserve">Beyond this sequence, three mechanisms recur across the studies and help to explain why the findings take the form they do. The first is technological capability. Absorptive capacity theory holds that the benefit an organisation or a country obtains from external technology depends on its prior knowledge and its ability to recognise, assimilate and apply new knowledge (Cohen &amp; Levinthal, 1990). In Chapter 4, technology capability mediates the effects of government incentives and innovation input on participation, so that public support is associated with participation mainly through the capability it builds. In Chapter 5, allowing terminal-specific intercepts and slopes improves the fit of the growth models, which shows that terminals operating under the same national regime differ in their technology levels and rates of technological progress, consistent with differences in organisational capability. In Chapter 6, the models show that onboard data can be used to predict fuel consumption and emissions and to identify blending ratios accurately, which is the analytical capability that operators and regulators need in order to adopt biofuel on the basis of evidence. Technology advancement therefore depends not only on access to technology but also on the capability to make use of it.</w:t>
+        <w:t xml:space="preserve">The three studies follow technology advancement from its development to its deployment and its sustainable use. At the national level, Chapter 4 shows that government incentives and innovation input are associated with a higher national technology development level, which is in turn associated with greater participation in transport and port technology projects. These results describe the enabling conditions, namely public funding, knowledge resources and a supportive R&amp;D environment, under which port organisations decide whether to invest in new technologies. At the organisational level, Chapter 5 examines how technology is embodied in landside cargo-handling equipment and translated into productivity: crane number and capacity follow throughput growth, and technological progress is associated with workforce education and with greater private participation in ownership. At the operational level, Chapter 6 turns to the waterside, where the question is no longer how much technology is deployed but whether its use is sustainable: biofuel blends reduce CO₂ and CO emissions but increase NOₓ emissions and fuel consumption, and machine-learning models make these effects measurable. Each level therefore carries implications for the next. The national technology development level and incentives shape the knowledge and resources available to terminal operators; operators’ investment and workforce decisions determine their readiness to adopt new technologies, including cleaner energy; and operational evidence on sustainability trade-offs indicates where national policy and port regulation may need to intervene, for example through complementary NOₓ control. Although the levels run from macro to micro, they are not nested within one another, because each is examined in a different setting: the Chinese terminals are not part of the European sample, and the Singapore harbour craft are not part of the Chinese terminal system. The levels are therefore analytical rather than hierarchical, and the links between them are conceptual implications rather than estimated cross-level effects. The level distinction is complemented by a functional one. Chapter 5 addresses landside cargo handling, where productivity is the main objective, and Chapter 6 addresses waterside port services, where emissions are the main concern. Together they cover the two main operating domains of a port.</w:t>
+      </w:r>
+    </w:p>
+    <w:p>
+      <w:pPr>
+        <w:pStyle w:val="BodyText"/>
+      </w:pPr>
+      <w:r>
+        <w:rPr>
+          <w:color w:val="7030A0"/>
+        </w:rPr>
+        <w:t xml:space="preserve">Beyond this sequence, three mechanisms recur across the studies and help to explain why the findings take the form they do. The first is technological capability. Absorptive capacity theory holds that the benefit an organisation or a country obtains from external technology depends on its prior knowledge and its ability to recognise, assimilate and apply new knowledge (Cohen &amp; Levinthal, 1990). In Chapter 4, the national technology development level, which reflects what national capabilities have achieved, mediates the effects of government incentives and innovation input on participation, so that public support is associated with participation mainly through the technological development it supports. In Chapter 5, allowing terminal-specific intercepts and slopes improves the fit of the growth models, which shows that terminals operating under the same national regime differ in their technology levels and rates of technological progress, consistent with differences in organisational capability. In Chapter 6, the models show that onboard data can be used to predict fuel consumption and emissions and to identify blending ratios accurately, which is the analytical capability that operators and regulators need in order to adopt biofuel on the basis of evidence. Technology advancement therefore depends not only on access to technology but also on the capability to make use of it.</w:t>
       </w:r>
     </w:p>
     <w:p>
@@ -994,7 +994,7 @@
         <w:rPr>
           <w:color w:val="7030A0"/>
         </w:rPr>
-        <w:t xml:space="preserve">European countries were selected for the national-level study because they combine harmonised cross-national data with substantial differences in innovation performance within a broadly common policy framework (European Commission, 2024; Kaiser &amp; Prange, 2004; OECD, 2015). These characteristics also help to explain the findings. Most of the projects examined in Chapter 4 are funded by the European Commission or by European national governments, and taking part in them is a decision of the organisations concerned. In such a setting, government incentives would be expected to work indirectly, by building the capability that makes participation feasible, which is consistent with the mediating role of technology capability found in Chapter 4. The importance of the R&amp;D environment in the port case likewise reflects institutional conditions, such as the security of property rights and academic freedom, which differ across the countries in the sample. The Continental European port doctrine, under which public investment in ports is justified by wider economic and social benefits (Lee &amp; Flynn, 2011), offers a further reason why public support is closely associated with participation. For European policymakers, the implication is that strengthening national technology capability is likely to be more effective than funding individual projects alone. The results also apply most directly to countries with comparable institutional quality.</w:t>
+        <w:t xml:space="preserve">European countries were selected for the national-level study because they combine harmonised cross-national data with substantial differences in innovation performance within a broadly common policy framework (European Commission, 2024; Kaiser &amp; Prange, 2004; OECD, 2015). These characteristics also help to explain the findings. Most of the projects examined in Chapter 4 are funded by the European Commission or by European national governments, and taking part in them is a decision of the organisations concerned. In such a setting, government incentives would be expected to work indirectly, by supporting the technological development that makes participation feasible, which is consistent with the mediating role of the technology development level found in Chapter 4. The importance of the R&amp;D environment in the port case likewise reflects institutional conditions, such as the security of property rights and academic freedom, which differ across the countries in the sample. The Continental European port doctrine, under which public investment in ports is justified by wider economic and social benefits (Lee &amp; Flynn, 2011), offers a further reason why public support is closely associated with participation. For European policymakers, the implication is that raising the national technology development level is likely to be more effective than funding individual projects alone. The results also apply most directly to countries with comparable institutional quality.</w:t>
       </w:r>
     </w:p>
     <w:p>
@@ -1849,7 +1849,7 @@
                 <w:color w:val="7030A0"/>
                 <w:sz w:val="18"/>
               </w:rPr>
-              <w:t xml:space="preserve">Incentives → capability → participation (Ch. 4)</w:t>
+              <w:t xml:space="preserve">Incentives → development level → participation (Ch. 4)</w:t>
             </w:r>
           </w:p>
         </w:tc>
@@ -2109,18 +2109,18 @@
         <w:rPr>
           <w:color w:val="7030A0"/>
         </w:rPr>
-        <w:t xml:space="preserve">Transferability is limited not only by context but also by the nature of technology itself. As discussed in Sections 2.1.2 and 2.4, technology is heterogeneous and is usually embodied in machines and equipment. Each study therefore measures technology in a form suited to its level: national capability indicators in Chapter 4, the number and capacity of cranes together with the Malmquist frontier shift in Chapter 5, and the performance of fuel blends in a given engine in Chapter 6. The findings refer to these specific forms of technology and should not be generalised to technology as a whole. The Chapter 5 results concern cargo-handling cranes in container terminals and may not hold for digital systems, and the Chapter 6 results concern biodiesel blends in high-speed diesel engines and may differ for other engine types (Chountalas et al., 2023).</w:t>
-      </w:r>
-    </w:p>
-    <w:p>
-      <w:pPr>
-        <w:pStyle w:val="BodyText"/>
-      </w:pPr>
-      <w:r>
-        <w:rPr>
-          <w:color w:val="7030A0"/>
-        </w:rPr>
-        <w:t xml:space="preserve">The European finding that incentives work largely by strengthening capability is most likely to be repeated in economies with strong innovation systems and voluntary, project-based participation in technology development, such as advanced Asian economies. Where governments plan and finance port technology directly, as is common under the Asian port doctrine (Lee &amp; Flynn, 2011), participation may be driven by state programmes rather than by capability built through incentives. The mediating role of capability may then be weaker. In such settings, the European result should inform the design of policy rather than be copied directly (Dolowitz &amp; Marsh, 2000).</w:t>
+        <w:t xml:space="preserve">Transferability is limited not only by context but also by the nature of technology itself. As discussed in Sections 2.1.2 and 2.4, technology is heterogeneous and is usually embodied in machines and equipment. Each study therefore measures technology in a form suited to its level: national indicators of the technology development level in Chapter 4, the number and capacity of cranes together with the Malmquist frontier shift in Chapter 5, and the performance of fuel blends in a given engine in Chapter 6. The findings refer to these specific forms of technology and should not be generalised to technology as a whole. The Chapter 5 results concern cargo-handling cranes in container terminals and may not hold for digital systems, and the Chapter 6 results concern biodiesel blends in high-speed diesel engines and may differ for other engine types (Chountalas et al., 2023).</w:t>
+      </w:r>
+    </w:p>
+    <w:p>
+      <w:pPr>
+        <w:pStyle w:val="BodyText"/>
+      </w:pPr>
+      <w:r>
+        <w:rPr>
+          <w:color w:val="7030A0"/>
+        </w:rPr>
+        <w:t xml:space="preserve">The European finding that incentives work largely by raising the technology development level is most likely to be repeated in economies with strong innovation systems and voluntary, project-based participation in technology development, such as advanced Asian economies. Where governments plan and finance port technology directly, as is common under the Asian port doctrine (Lee &amp; Flynn, 2011), participation may be driven by state programmes rather than by technological development built through incentives. The mediating role of the development level may then be weaker. In such settings, the European result should inform the design of policy rather than be copied directly (Dolowitz &amp; Marsh, 2000).</w:t>
       </w:r>
     </w:p>
     <w:p>
@@ -2534,7 +2534,7 @@
                 <w:color w:val="7030A0"/>
                 <w:sz w:val="18"/>
               </w:rPr>
-              <w:t xml:space="preserve">Technology capability</w:t>
+              <w:t xml:space="preserve">Technology development level</w:t>
             </w:r>
           </w:p>
         </w:tc>
@@ -2616,7 +2616,7 @@
                 <w:color w:val="7030A0"/>
                 <w:sz w:val="18"/>
               </w:rPr>
-              <w:t xml:space="preserve">Technology capability</w:t>
+              <w:t xml:space="preserve">Technology development level</w:t>
             </w:r>
           </w:p>
         </w:tc>

</xml_diff>